<commit_message>
Lomba Kaltara: kanal publik dipisah dari alur agenda; slide 7 diperjelas
Paparan: demo (slide 6) menjadi enam langkah tanpa kanal publik; slide 7
dibaca sebelum → sesudah dengan angka penopang berurutan; slide 8 tidak lagi
memuat angka kanal publik; slide 9 baru khusus kanal publik (fitur lain);
slide cadangan menjadi slide 14.

Video: adegan kanal publik berlabel "Fitur lain" dengan narasi tersendiri;
angka 66 + 53 tidak lagi di adegan dampak. Lembar naskah dubber, takarir, dan
suara otomatis disesuaikan.

Co-Authored-By: Claude Opus 5.5 <noreply@anthropic.com>
Claude-Session: https://claude.ai/code/session_01TchDZWsQsgeuq52sKmozd1
</commit_message>
<xml_diff>
--- a/docs/lomba/kaltara/Lembar_Naskah_Dubber_Protokol.docx
+++ b/docs/lomba/kaltara/Lembar_Naskah_Dubber_Protokol.docx
@@ -990,7 +990,7 @@
               <w:rPr>
                 <w:sz w:val="24"/>
               </w:rPr>
-              <w:t>Masyarakat dan instansi mengajukan audiensi atau meminjam ruangan secara daring, lalu memantau sendiri statusnya.</w:t>
+              <w:t>Selain alur agenda itu, ada kanal publik, fitur tersendiri. Masyarakat dan instansi mengajukan audiensi atau meminjam ruangan secara daring, lalu memantau sendiri statusnya.</w:t>
             </w:r>
           </w:p>
         </w:tc>
@@ -1062,7 +1062,7 @@
               <w:rPr>
                 <w:sz w:val="24"/>
               </w:rPr>
-              <w:t>Per dua puluh empat September dua ribu dua puluh enam: lima ratus delapan puluh sembilan kegiatan terkelola. Waktu sampai tayang turun menjadi median satu koma sembilan puluh sembilan jam, dan sembilan puluh sembilan koma tiga persen tayang kurang dari sehari. Tiga ribu tujuh puluh dua keputusan terekam. Enam puluh enam instansi meminjam ruangan dan lima puluh tiga instansi mengajukan audiensi. Belanja pengadaannya nol rupiah.</w:t>
+              <w:t>Per dua puluh empat September dua ribu dua puluh enam: lima ratus delapan puluh sembilan kegiatan terkelola. Waktu sampai tayang turun menjadi median satu koma sembilan puluh sembilan jam, dan sembilan puluh sembilan koma tiga persen tayang kurang dari sehari. Tiga ribu tujuh puluh dua keputusan terekam. Sembilan puluh dua koma empat persen kegiatan memiliki penugasan petugas. Belanja pengadaannya nol rupiah.</w:t>
             </w:r>
           </w:p>
         </w:tc>

</xml_diff>

<commit_message>
Lomba Kaltara: perbaikan hasil telaah juri (video dan huruf paparan)
Video:
- Data contoh diberi riwayat alur sesuai tahap; layar Kasubbag/Kabag tidak lagi
  menampilkan "Belum ada riwayat alur".
- Adegan 10 berakhir di Riwayat Alur kegiatan (6 langkah) dan ditambah klip
  daftar hadir di ponsel (isi nama dan tanda tangan) sesuai narasi QR.
- Peringatan "jadwal belum ditugaskan" tidak lagi muncul di rekaman.
- Narasi adegan aplikasi diperpanjang; adegan 13 bernarasi; musik latar pelan
  (dibuat sendiri, bebas hak cipta). Tidak ada jeda hening di atas 2 detik.
- Latar belakang dipadatkan (35 → 25 detik); aplikasi tampil di 1:45.
  Durasi 4:40.

Paparan: batas bawah huruf 14 pt untuk teks isi; teks slide 5 dan 14 diringkas;
QR penutup berlabel "Alamat resmi aplikasi".

Co-Authored-By: Claude Opus 5.5 <noreply@anthropic.com>
Claude-Session: https://claude.ai/code/session_01TchDZWsQsgeuq52sKmozd1
</commit_message>
<xml_diff>
--- a/docs/lomba/kaltara/Lembar_Naskah_Dubber_Protokol.docx
+++ b/docs/lomba/kaltara/Lembar_Naskah_Dubber_Protokol.docx
@@ -318,7 +318,7 @@
               <w:rPr>
                 <w:sz w:val="20"/>
               </w:rPr>
-              <w:t>0:20–0:55</w:t>
+              <w:t>0:20–0:45</w:t>
               <w:br/>
             </w:r>
             <w:r>
@@ -326,7 +326,7 @@
                 <w:color w:val="5A5A5A"/>
                 <w:sz w:val="18"/>
               </w:rPr>
-              <w:t>maks 35 dtk</w:t>
+              <w:t>maks 25 dtk</w:t>
               <w:br/>
               <w:t>Latar belakang</w:t>
             </w:r>
@@ -390,7 +390,7 @@
               <w:rPr>
                 <w:sz w:val="20"/>
               </w:rPr>
-              <w:t>0:55–1:20</w:t>
+              <w:t>0:45–1:10</w:t>
               <w:br/>
             </w:r>
             <w:r>
@@ -462,7 +462,7 @@
               <w:rPr>
                 <w:sz w:val="20"/>
               </w:rPr>
-              <w:t>1:20–1:45</w:t>
+              <w:t>1:10–1:35</w:t>
               <w:br/>
             </w:r>
             <w:r>
@@ -534,7 +534,7 @@
               <w:rPr>
                 <w:sz w:val="20"/>
               </w:rPr>
-              <w:t>1:45–1:55</w:t>
+              <w:t>1:35–1:45</w:t>
               <w:br/>
             </w:r>
             <w:r>
@@ -606,7 +606,7 @@
               <w:rPr>
                 <w:sz w:val="20"/>
               </w:rPr>
-              <w:t>1:55–2:10</w:t>
+              <w:t>1:45–2:05</w:t>
               <w:br/>
             </w:r>
             <w:r>
@@ -614,7 +614,7 @@
                 <w:color w:val="5A5A5A"/>
                 <w:sz w:val="18"/>
               </w:rPr>
-              <w:t>maks 15 dtk</w:t>
+              <w:t>maks 20 dtk</w:t>
               <w:br/>
               <w:t>Manfaat</w:t>
             </w:r>
@@ -630,7 +630,7 @@
               <w:rPr>
                 <w:sz w:val="24"/>
               </w:rPr>
-              <w:t>Admin Rencana Kegiatan memasukkan undangan, cukup dengan memindainya.</w:t>
+              <w:t>Admin Rencana Kegiatan cukup memindai undangan. Kecerdasan buatan mengisi nama acara, tanggal, jam, lokasi, dan zona waktunya. Admin tinggal memeriksa, lalu mengirimkannya ke Kepala Sub Bagian.</w:t>
             </w:r>
           </w:p>
         </w:tc>
@@ -645,7 +645,7 @@
                 <w:i/>
                 <w:sz w:val="20"/>
               </w:rPr>
-              <w:t>Ceria, ringan.</w:t>
+              <w:t>Ceria, ringan; daftar isian dibaca mengalir.</w:t>
             </w:r>
           </w:p>
         </w:tc>
@@ -678,7 +678,7 @@
               <w:rPr>
                 <w:sz w:val="20"/>
               </w:rPr>
-              <w:t>2:10–2:25</w:t>
+              <w:t>2:05–2:20</w:t>
               <w:br/>
             </w:r>
             <w:r>
@@ -702,7 +702,7 @@
               <w:rPr>
                 <w:sz w:val="24"/>
               </w:rPr>
-              <w:t>Kepala Sub Bagian menelaah dari mana saja. Tombol persetujuan baru aktif setelah butir pemeriksaan dicentang.</w:t>
+              <w:t>Kepala Sub Bagian menelaah dari mana saja, cukup lewat telepon. Tombol persetujuan baru aktif setelah undangan dibuka dan butir pemeriksaan dicentang.</w:t>
             </w:r>
           </w:p>
         </w:tc>
@@ -750,7 +750,7 @@
               <w:rPr>
                 <w:sz w:val="20"/>
               </w:rPr>
-              <w:t>2:25–2:35</w:t>
+              <w:t>2:20–2:30</w:t>
               <w:br/>
             </w:r>
             <w:r>
@@ -774,7 +774,7 @@
               <w:rPr>
                 <w:sz w:val="24"/>
               </w:rPr>
-              <w:t>Kepala Bagian memeriksa dan memutus, dari mana saja.</w:t>
+              <w:t>Kepala Bagian memeriksa dan memutus, dari mana saja. Sekali disetujui, agenda langsung tayang.</w:t>
             </w:r>
           </w:p>
         </w:tc>
@@ -822,7 +822,7 @@
               <w:rPr>
                 <w:sz w:val="20"/>
               </w:rPr>
-              <w:t>2:35–2:55</w:t>
+              <w:t>2:30–2:50</w:t>
               <w:br/>
             </w:r>
             <w:r>
@@ -846,7 +846,7 @@
               <w:rPr>
                 <w:sz w:val="24"/>
               </w:rPr>
-              <w:t>Begitu tayang, agenda langsung ada di telepon Pimpinan. Ajudan mengonfirmasi kehadiran, dan Wali Kota dapat mendisposisikan kepada Wakil Wali Kota.</w:t>
+              <w:t>Begitu tayang, agenda langsung ada di telepon Pimpinan. Ajudan mengonfirmasi kehadiran, dan Wali Kota dapat mendisposisikan kepada Wakil Wali Kota. Tidak ada lagi foto disposisi yang berpindah dari grup ke grup.</w:t>
             </w:r>
           </w:p>
         </w:tc>
@@ -861,7 +861,7 @@
                 <w:i/>
                 <w:sz w:val="20"/>
               </w:rPr>
-              <w:t>Satu napas per kalimat.</w:t>
+              <w:t>Satu napas per kalimat; kalimat terakhir lebih pelan.</w:t>
             </w:r>
           </w:p>
         </w:tc>
@@ -894,7 +894,7 @@
               <w:rPr>
                 <w:sz w:val="20"/>
               </w:rPr>
-              <w:t>2:55–3:10</w:t>
+              <w:t>2:50–3:10</w:t>
               <w:br/>
             </w:r>
             <w:r>
@@ -902,7 +902,7 @@
                 <w:color w:val="5A5A5A"/>
                 <w:sz w:val="18"/>
               </w:rPr>
-              <w:t>maks 15 dtk</w:t>
+              <w:t>maks 20 dtk</w:t>
               <w:br/>
               <w:t>Manfaat</w:t>
             </w:r>
@@ -918,7 +918,7 @@
               <w:rPr>
                 <w:sz w:val="24"/>
               </w:rPr>
-              <w:t>Petugas ditugaskan dan diberi tahu, daftar hadir cukup dengan kode QR, dan setiap langkah tercatat: siapa, kapan, apa keputusannya.</w:t>
+              <w:t>Petugas ditugaskan dan langsung diberi tahu. Setiap langkah tercatat: siapa, kapan, dan apa keputusannya. Di lokasi, tamu cukup memindai kode QR untuk mengisi daftar hadir, lengkap dengan tanda tangan.</w:t>
             </w:r>
           </w:p>
         </w:tc>
@@ -933,7 +933,7 @@
                 <w:i/>
                 <w:sz w:val="20"/>
               </w:rPr>
-              <w:t>"Siapa, kapan, apa keputusannya" dibaca dengan tiga hentakan.</w:t>
+              <w:t>"Siapa, kapan, dan apa keputusannya" dibaca dengan tiga hentakan.</w:t>
             </w:r>
           </w:p>
         </w:tc>
@@ -990,7 +990,7 @@
               <w:rPr>
                 <w:sz w:val="24"/>
               </w:rPr>
-              <w:t>Selain alur agenda itu, ada kanal publik, fitur tersendiri. Masyarakat dan instansi mengajukan audiensi atau meminjam ruangan secara daring, lalu memantau sendiri statusnya.</w:t>
+              <w:t>Selain alur agenda itu, ada kanal publik, fitur tersendiri. Masyarakat dan instansi mengajukan audiensi atau meminjam ruangan secara daring, lalu memantau sendiri statusnya, tanpa perlu datang berulang.</w:t>
             </w:r>
           </w:p>
         </w:tc>
@@ -1005,7 +1005,7 @@
                 <w:i/>
                 <w:sz w:val="20"/>
               </w:rPr>
-              <w:t>Hangat, lugas.</w:t>
+              <w:t>Ganti nada sedikit: ini fitur lain.</w:t>
             </w:r>
           </w:p>
         </w:tc>
@@ -1089,7 +1089,6 @@
         <w:tc>
           <w:tcPr>
             <w:tcW w:type="dxa" w:w="680"/>
-            <w:shd w:val="clear" w:color="auto" w:fill="F3F4F6"/>
           </w:tcPr>
           <w:p>
             <w:r/>
@@ -1104,7 +1103,6 @@
         <w:tc>
           <w:tcPr>
             <w:tcW w:type="dxa" w:w="1474"/>
-            <w:shd w:val="clear" w:color="auto" w:fill="F3F4F6"/>
           </w:tcPr>
           <w:p>
             <w:r/>
@@ -1112,7 +1110,7 @@
               <w:rPr>
                 <w:sz w:val="20"/>
               </w:rPr>
-              <w:t>4:05–4:20</w:t>
+              <w:t>4:05–4:15</w:t>
               <w:br/>
             </w:r>
             <w:r>
@@ -1120,7 +1118,7 @@
                 <w:color w:val="5A5A5A"/>
                 <w:sz w:val="18"/>
               </w:rPr>
-              <w:t>maks 15 dtk</w:t>
+              <w:t>maks 10 dtk</w:t>
               <w:br/>
               <w:t>Dampak</w:t>
             </w:r>
@@ -1129,7 +1127,6 @@
         <w:tc>
           <w:tcPr>
             <w:tcW w:type="dxa" w:w="4932"/>
-            <w:shd w:val="clear" w:color="auto" w:fill="F3F4F6"/>
           </w:tcPr>
           <w:p>
             <w:r/>
@@ -1137,14 +1134,13 @@
               <w:rPr>
                 <w:sz w:val="24"/>
               </w:rPr>
-              <w:t>(Tanpa suara bila cuplikan Wali Kota atau ajudan tersedia. Bila hanya teks, dubber membaca kutipan:) Yang terpenting bagi saya adalah kepastian: ke mana saya harus hadir, kapan, dan siapa yang menyiapkannya.</w:t>
+              <w:t>Bagi Wali Kota, yang terpenting adalah kepastian: ke mana harus hadir, kapan, dan siapa yang menyiapkannya.</w:t>
             </w:r>
           </w:p>
         </w:tc>
         <w:tc>
           <w:tcPr>
             <w:tcW w:type="dxa" w:w="2551"/>
-            <w:shd w:val="clear" w:color="auto" w:fill="F3F4F6"/>
           </w:tcPr>
           <w:p>
             <w:r/>
@@ -1153,7 +1149,7 @@
                 <w:i/>
                 <w:sz w:val="20"/>
               </w:rPr>
-              <w:t>Opsional. Bila dibaca, tenang dan hormat.</w:t>
+              <w:t>Tenang dan hormat. Kutipan aslinya tampil di layar.</w:t>
             </w:r>
           </w:p>
         </w:tc>
@@ -1186,7 +1182,7 @@
               <w:rPr>
                 <w:sz w:val="20"/>
               </w:rPr>
-              <w:t>4:20–4:35</w:t>
+              <w:t>4:15–4:30</w:t>
               <w:br/>
             </w:r>
             <w:r>
@@ -1258,7 +1254,7 @@
               <w:rPr>
                 <w:sz w:val="20"/>
               </w:rPr>
-              <w:t>4:35–4:45</w:t>
+              <w:t>4:30–4:40</w:t>
               <w:br/>
             </w:r>
             <w:r>
@@ -1282,7 +1278,7 @@
               <w:rPr>
                 <w:sz w:val="24"/>
               </w:rPr>
-              <w:t>Satu alur. Satu data. Setiap keputusan tercatat.</w:t>
+              <w:t>Prokopim Hibot. Satu alur. Satu data. Setiap keputusan tercatat.</w:t>
             </w:r>
           </w:p>
         </w:tc>
@@ -1297,7 +1293,7 @@
                 <w:i/>
                 <w:sz w:val="20"/>
               </w:rPr>
-              <w:t>Tiga kalimat, tiga hentakan, jeda 0,7 detik; kalimat terakhir paling kuat.</w:t>
+              <w:t>Empat hentakan, jeda 0,7 detik; kalimat terakhir paling kuat.</w:t>
             </w:r>
           </w:p>
         </w:tc>
@@ -1324,18 +1320,6 @@
           <w:i/>
         </w:rPr>
         <w:t>Yang dikirim kembali: seluruh berkas adegan, ke Admin Rencana Kegiatan atau Kabag Prokopim. Bila ada kata yang sulit diucapkan atau kalimat yang terasa terlalu panjang, tandai nomor adegannya dan sampaikan; naskah bisa dipersingkat.</w:t>
-      </w:r>
-    </w:p>
-    <w:p>
-      <w:pPr>
-        <w:spacing w:after="40"/>
-      </w:pPr>
-      <w:r>
-        <w:rPr>
-          <w:b w:val="0"/>
-          <w:i/>
-        </w:rPr>
-        <w:t>Adegan 13 (abu-abu) bersifat opsional: dibaca hanya bila cuplikan Wali Kota atau ajudan tidak tersedia.</w:t>
       </w:r>
     </w:p>
     <w:sectPr>

</xml_diff>

<commit_message>
Lomba Kaltara: "hemat kertas" di paparan dan narasi video
Slide 7 mendapat kartu "Hemat kertas" (tanpa cetak ulang RK; 452 undangan
terarsip digital). Narasi adegan 8 dan 10 menyebut tanpa cetak ulang dan
daftar hadir tanpa kertas. Angka hanya dari proposal; tidak ada perkiraan
jumlah lembar yang dikarang.

Co-Authored-By: Claude Opus 5.5 <noreply@anthropic.com>
Claude-Session: https://claude.ai/code/session_01TchDZWsQsgeuq52sKmozd1
</commit_message>
<xml_diff>
--- a/docs/lomba/kaltara/Lembar_Naskah_Dubber_Protokol.docx
+++ b/docs/lomba/kaltara/Lembar_Naskah_Dubber_Protokol.docx
@@ -774,7 +774,7 @@
               <w:rPr>
                 <w:sz w:val="24"/>
               </w:rPr>
-              <w:t>Kepala Bagian memeriksa dan memutus, dari mana saja. Sekali disetujui, agenda langsung tayang.</w:t>
+              <w:t>Kepala Bagian memeriksa dan memutus, dari mana saja. Sekali disetujui, agenda langsung tayang, tanpa cetak ulang.</w:t>
             </w:r>
           </w:p>
         </w:tc>
@@ -918,7 +918,7 @@
               <w:rPr>
                 <w:sz w:val="24"/>
               </w:rPr>
-              <w:t>Petugas ditugaskan dan langsung diberi tahu. Setiap langkah tercatat: siapa, kapan, dan apa keputusannya. Di lokasi, tamu cukup memindai kode QR untuk mengisi daftar hadir, lengkap dengan tanda tangan.</w:t>
+              <w:t>Petugas ditugaskan dan langsung diberi tahu. Setiap langkah tercatat: siapa, kapan, dan apa keputusannya. Di lokasi, tamu cukup memindai kode QR untuk mengisi daftar hadir, lengkap dengan tanda tangan, tanpa selembar kertas pun.</w:t>
             </w:r>
           </w:p>
         </w:tc>

</xml_diff>

<commit_message>
Video lomba: pakai suara asli Wali Kota di adegan 9 dan 13
Adegan 9 dibuka 6 detik suara asli, narasi masuk sesudahnya; adegan 13
tanpa narasi otomatis. Musik diredam selama beliau berbicara. Lembar
naskah dubber disesuaikan.

Co-Authored-By: Claude Opus 5.5 <noreply@anthropic.com>
Claude-Session: https://claude.ai/code/session_01TchDZWsQsgeuq52sKmozd1
</commit_message>
<xml_diff>
--- a/docs/lomba/kaltara/Lembar_Naskah_Dubber_Protokol.docx
+++ b/docs/lomba/kaltara/Lembar_Naskah_Dubber_Protokol.docx
@@ -846,7 +846,7 @@
               <w:rPr>
                 <w:sz w:val="24"/>
               </w:rPr>
-              <w:t>Begitu tayang, agenda langsung ada di telepon Pimpinan. Ajudan mengonfirmasi kehadiran, dan Wali Kota dapat mendisposisikan kepada Wakil Wali Kota. Tidak ada lagi foto disposisi yang berpindah dari grup ke grup.</w:t>
+              <w:t>Ajudan mengonfirmasi kehadiran, dan Wali Kota dapat mendisposisikan kepada Wakil Wali Kota. Tidak ada lagi foto disposisi yang berpindah dari grup ke grup.</w:t>
             </w:r>
           </w:p>
         </w:tc>
@@ -861,7 +861,7 @@
                 <w:i/>
                 <w:sz w:val="20"/>
               </w:rPr>
-              <w:t>Satu napas per kalimat; kalimat terakhir lebih pelan.</w:t>
+              <w:t>Masuk di 2:36, sesudah 6 detik suara asli Wali Kota. Satu napas per kalimat; kalimat terakhir lebih pelan.</w:t>
             </w:r>
           </w:p>
         </w:tc>
@@ -1134,7 +1134,7 @@
               <w:rPr>
                 <w:sz w:val="24"/>
               </w:rPr>
-              <w:t>Bagi Wali Kota, yang terpenting adalah kepastian: ke mana harus hadir, kapan, dan siapa yang menyiapkannya.</w:t>
+              <w:t>(Tanpa narasi. Suara asli Wali Kota diputar.)</w:t>
             </w:r>
           </w:p>
         </w:tc>
@@ -1149,7 +1149,7 @@
                 <w:i/>
                 <w:sz w:val="20"/>
               </w:rPr>
-              <w:t>Tenang dan hormat. Kutipan aslinya tampil di layar.</w:t>
+              <w:t>Dubber tidak membaca apa pun; jangan menimpa suara beliau.</w:t>
             </w:r>
           </w:p>
         </w:tc>

</xml_diff>

<commit_message>
Video lomba: adegan 13 memakai pernyataan asli Wali Kota
Empat kutipan dari video pernyataan 19 Oktober disambung menjadi 25 detik
dengan takarir ucapan dan papan nama. Klip lama ternyata hanya berisi suara
ruangan, jadi adegan 9 kembali bernarasi penuh. Durasi video 4:55; takarir,
naskah dubber, dan potongan vertikal disesuaikan.

Co-Authored-By: Claude Opus 5.5 <noreply@anthropic.com>
Claude-Session: https://claude.ai/code/session_01TchDZWsQsgeuq52sKmozd1
</commit_message>
<xml_diff>
--- a/docs/lomba/kaltara/Lembar_Naskah_Dubber_Protokol.docx
+++ b/docs/lomba/kaltara/Lembar_Naskah_Dubber_Protokol.docx
@@ -846,7 +846,7 @@
               <w:rPr>
                 <w:sz w:val="24"/>
               </w:rPr>
-              <w:t>Ajudan mengonfirmasi kehadiran, dan Wali Kota dapat mendisposisikan kepada Wakil Wali Kota. Tidak ada lagi foto disposisi yang berpindah dari grup ke grup.</w:t>
+              <w:t>Begitu tayang, agenda langsung ada di telepon Pimpinan. Ajudan mengonfirmasi kehadiran, dan Wali Kota dapat mendisposisikan kepada Wakil Wali Kota. Tidak ada lagi foto disposisi yang berpindah dari grup ke grup.</w:t>
             </w:r>
           </w:p>
         </w:tc>
@@ -861,7 +861,7 @@
                 <w:i/>
                 <w:sz w:val="20"/>
               </w:rPr>
-              <w:t>Masuk di 2:36, sesudah 6 detik suara asli Wali Kota. Satu napas per kalimat; kalimat terakhir lebih pelan.</w:t>
+              <w:t>Satu napas per kalimat; kalimat terakhir lebih pelan.</w:t>
             </w:r>
           </w:p>
         </w:tc>
@@ -1110,7 +1110,7 @@
               <w:rPr>
                 <w:sz w:val="20"/>
               </w:rPr>
-              <w:t>4:05–4:15</w:t>
+              <w:t>4:05–4:30</w:t>
               <w:br/>
             </w:r>
             <w:r>
@@ -1118,7 +1118,7 @@
                 <w:color w:val="5A5A5A"/>
                 <w:sz w:val="18"/>
               </w:rPr>
-              <w:t>maks 10 dtk</w:t>
+              <w:t>maks 25 dtk</w:t>
               <w:br/>
               <w:t>Dampak</w:t>
             </w:r>
@@ -1134,7 +1134,7 @@
               <w:rPr>
                 <w:sz w:val="24"/>
               </w:rPr>
-              <w:t>(Tanpa narasi. Suara asli Wali Kota diputar.)</w:t>
+              <w:t>(Tanpa narasi. Pernyataan asli Wali Kota diputar.)</w:t>
             </w:r>
           </w:p>
         </w:tc>
@@ -1182,7 +1182,7 @@
               <w:rPr>
                 <w:sz w:val="20"/>
               </w:rPr>
-              <w:t>4:15–4:30</w:t>
+              <w:t>4:30–4:45</w:t>
               <w:br/>
             </w:r>
             <w:r>
@@ -1254,7 +1254,7 @@
               <w:rPr>
                 <w:sz w:val="20"/>
               </w:rPr>
-              <w:t>4:30–4:40</w:t>
+              <w:t>4:45–4:55</w:t>
               <w:br/>
             </w:r>
             <w:r>

</xml_diff>

<commit_message>
Lomba Kaltara: agenda Pimpinan sebagai manfaat utama; daftar hadir tidak ditonjolkan
- Video: adegan 10 hanya penugasan dan jejak audit (Pelaksana Harian),
  adegan 11 dipisah menjadi ruang rapat bagi instansi dan audiensi/tamu bagi
  instansi dan masyarakat; adegan 9 menyebut Wali Kota dan Wakil.
- Paparan: slide 8 'Manfaat utama', slide 9 'Layanan pendukung' dengan
  pembagian penerima manfaat; istilah kanal publik disesuaikan; naskah,
  takarir, dan naskah dubber diperbarui.

Co-Authored-By: Claude Opus 5.5 <noreply@anthropic.com>
Claude-Session: https://claude.ai/code/session_01TchDZWsQsgeuq52sKmozd1
</commit_message>
<xml_diff>
--- a/docs/lomba/kaltara/Lembar_Naskah_Dubber_Protokol.docx
+++ b/docs/lomba/kaltara/Lembar_Naskah_Dubber_Protokol.docx
@@ -846,7 +846,7 @@
               <w:rPr>
                 <w:sz w:val="24"/>
               </w:rPr>
-              <w:t>Begitu tayang, agenda langsung ada di telepon Pimpinan. Ajudan mengonfirmasi kehadiran, dan Wali Kota dapat mendisposisikan kepada Wakil Wali Kota. Tidak ada lagi foto disposisi yang berpindah dari grup ke grup.</w:t>
+              <w:t>Begitu tayang, agenda langsung ada di telepon Wali Kota dan Wakil Wali Kota. Ajudan mengonfirmasi kehadiran, dan Wali Kota dapat mendisposisikan kepada Wakil Wali Kota. Tidak ada lagi foto disposisi yang berpindah dari grup ke grup.</w:t>
             </w:r>
           </w:p>
         </w:tc>
@@ -918,7 +918,7 @@
               <w:rPr>
                 <w:sz w:val="24"/>
               </w:rPr>
-              <w:t>Petugas ditugaskan dan langsung diberi tahu. Setiap langkah tercatat: siapa, kapan, dan apa keputusannya. Di lokasi, tamu cukup memindai kode QR untuk mengisi daftar hadir, lengkap dengan tanda tangan, tanpa selembar kertas pun.</w:t>
+              <w:t>Petugas ditugaskan dan langsung diberi tahu. Setiap langkah tercatat di Riwayat Alur: siapa, kapan, dan apa keputusannya. Bila Kepala Bagian berhalangan, Pelaksana Harian melanjutkan alur, dan kewenangannya padam sendiri pada tanggal akhirnya.</w:t>
             </w:r>
           </w:p>
         </w:tc>
@@ -933,7 +933,7 @@
                 <w:i/>
                 <w:sz w:val="20"/>
               </w:rPr>
-              <w:t>"Siapa, kapan, dan apa keputusannya" dibaca dengan tiga hentakan.</w:t>
+              <w:t>Tenang dan runtut; ini masih alur utama agenda.</w:t>
             </w:r>
           </w:p>
         </w:tc>
@@ -976,7 +976,7 @@
               </w:rPr>
               <w:t>maks 20 dtk</w:t>
               <w:br/>
-              <w:t>Manfaat</w:t>
+              <w:t>Manfaat bagi instansi dan masyarakat</w:t>
             </w:r>
           </w:p>
         </w:tc>
@@ -990,7 +990,7 @@
               <w:rPr>
                 <w:sz w:val="24"/>
               </w:rPr>
-              <w:t>Selain alur agenda itu, ada kanal publik, fitur tersendiri. Masyarakat dan instansi mengajukan audiensi atau meminjam ruangan secara daring, lalu memantau sendiri statusnya, tanpa perlu datang berulang.</w:t>
+              <w:t>Selain agenda Pimpinan, ada dua layanan pendukung. Bagi instansi, peminjaman ruang rapat secara daring. Bagi instansi dan masyarakat, permohonan audiensi dan bertamu kepada Pimpinan, yang statusnya dipantau sendiri dengan kode.</w:t>
             </w:r>
           </w:p>
         </w:tc>
@@ -1005,7 +1005,7 @@
                 <w:i/>
                 <w:sz w:val="20"/>
               </w:rPr>
-              <w:t>Ganti nada sedikit: ini fitur lain.</w:t>
+              <w:t>Ganti nada sedikit: layanan pendukung di luar agenda Pimpinan.</w:t>
             </w:r>
           </w:p>
         </w:tc>

</xml_diff>

<commit_message>
Lomba Kaltara: bacaan dubbing berhuruf besar per adegan; arahan naskah dubber diperbarui
Co-Authored-By: Claude Opus 5.5 <noreply@anthropic.com>
Claude-Session: https://claude.ai/code/session_01TchDZWsQsgeuq52sKmozd1
</commit_message>
<xml_diff>
--- a/docs/lomba/kaltara/Lembar_Naskah_Dubber_Protokol.docx
+++ b/docs/lomba/kaltara/Lembar_Naskah_Dubber_Protokol.docx
@@ -285,7 +285,7 @@
                 <w:i/>
                 <w:sz w:val="20"/>
               </w:rPr>
-              <w:t>Pelan dan datar; jeda 1 detik setelah "hanya dua".</w:t>
+              <w:t>Pelan dan datar; jeda 1 detik setelah "hanya satu".</w:t>
             </w:r>
           </w:p>
         </w:tc>
@@ -1221,7 +1221,7 @@
                 <w:i/>
                 <w:sz w:val="20"/>
               </w:rPr>
-              <w:t>Nada optimis.</w:t>
+              <w:t>Nada optimis. Jeda sejenak sebelum "Sejak proposal"; tekan "enam pembaruan".</w:t>
             </w:r>
           </w:p>
         </w:tc>

</xml_diff>